<commit_message>
Loads of new counters, map, cards, rules
Signed-off-by: euroledger <geominat@gmail.com>
</commit_message>
<xml_diff>
--- a/MYRULES.docx
+++ b/MYRULES.docx
@@ -2646,7 +2646,7 @@
           </mc:Choice>
           <mc:Fallback>
             <w:pict>
-              <v:shapetype w14:anchorId="77FFEC70" id="_x0000_t32" coordsize="21600,21600" o:spt="32" o:oned="t" path="m,l21600,21600e" filled="f">
+              <v:shapetype w14:anchorId="67B32B4E" id="_x0000_t32" coordsize="21600,21600" o:spt="32" o:oned="t" path="m,l21600,21600e" filled="f">
                 <v:path arrowok="t" fillok="f" o:connecttype="none"/>
                 <o:lock v:ext="edit" shapetype="t"/>
               </v:shapetype>
@@ -2731,7 +2731,7 @@
           </mc:Choice>
           <mc:Fallback>
             <w:pict>
-              <v:shape w14:anchorId="458E4784" id="AutoShape 28" o:spid="_x0000_s1026" type="#_x0000_t32" style="position:absolute;margin-left:240.95pt;margin-top:47.45pt;width:42.05pt;height:14.25pt;flip:y;z-index:251666944;visibility:visible;mso-wrap-style:square;mso-width-percent:0;mso-height-percent:0;mso-wrap-distance-left:9pt;mso-wrap-distance-top:0;mso-wrap-distance-right:9pt;mso-wrap-distance-bottom:0;mso-position-horizontal:absolute;mso-position-horizontal-relative:text;mso-position-vertical:absolute;mso-position-vertical-relative:text;mso-width-percent:0;mso-height-percent:0;mso-width-relative:page;mso-height-relative:page" o:gfxdata="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">
+              <v:shape w14:anchorId="72C3CD39" id="AutoShape 28" o:spid="_x0000_s1026" type="#_x0000_t32" style="position:absolute;margin-left:240.95pt;margin-top:47.45pt;width:42.05pt;height:14.25pt;flip:y;z-index:251666944;visibility:visible;mso-wrap-style:square;mso-width-percent:0;mso-height-percent:0;mso-wrap-distance-left:9pt;mso-wrap-distance-top:0;mso-wrap-distance-right:9pt;mso-wrap-distance-bottom:0;mso-position-horizontal:absolute;mso-position-horizontal-relative:text;mso-position-vertical:absolute;mso-position-vertical-relative:text;mso-width-percent:0;mso-height-percent:0;mso-width-relative:page;mso-height-relative:page" o:gfxdata="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">
                 <v:stroke endarrow="block"/>
               </v:shape>
             </w:pict>
@@ -2911,7 +2911,7 @@
           </mc:Choice>
           <mc:Fallback>
             <w:pict>
-              <v:shape w14:anchorId="445C3C5D" id="AutoShape 25" o:spid="_x0000_s1026" type="#_x0000_t32" style="position:absolute;margin-left:245.3pt;margin-top:23.2pt;width:37.7pt;height:7.5pt;z-index:251663872;visibility:visible;mso-wrap-style:square;mso-width-percent:0;mso-height-percent:0;mso-wrap-distance-left:9pt;mso-wrap-distance-top:0;mso-wrap-distance-right:9pt;mso-wrap-distance-bottom:0;mso-position-horizontal:absolute;mso-position-horizontal-relative:text;mso-position-vertical:absolute;mso-position-vertical-relative:text;mso-width-percent:0;mso-height-percent:0;mso-width-relative:page;mso-height-relative:page" o:gfxdata="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">
+              <v:shape w14:anchorId="7F36F593" id="AutoShape 25" o:spid="_x0000_s1026" type="#_x0000_t32" style="position:absolute;margin-left:245.3pt;margin-top:23.2pt;width:37.7pt;height:7.5pt;z-index:251663872;visibility:visible;mso-wrap-style:square;mso-width-percent:0;mso-height-percent:0;mso-wrap-distance-left:9pt;mso-wrap-distance-top:0;mso-wrap-distance-right:9pt;mso-wrap-distance-bottom:0;mso-position-horizontal:absolute;mso-position-horizontal-relative:text;mso-position-vertical:absolute;mso-position-vertical-relative:text;mso-width-percent:0;mso-height-percent:0;mso-width-relative:page;mso-height-relative:page" o:gfxdata="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">
                 <v:stroke endarrow="block"/>
               </v:shape>
             </w:pict>
@@ -2992,7 +2992,7 @@
           </mc:Choice>
           <mc:Fallback>
             <w:pict>
-              <v:shape w14:anchorId="1F1570AA" id="AutoShape 26" o:spid="_x0000_s1026" type="#_x0000_t32" style="position:absolute;margin-left:111.35pt;margin-top:23.2pt;width:34.3pt;height:1.65pt;flip:x;z-index:251664896;visibility:visible;mso-wrap-style:square;mso-width-percent:0;mso-height-percent:0;mso-wrap-distance-left:9pt;mso-wrap-distance-top:0;mso-wrap-distance-right:9pt;mso-wrap-distance-bottom:0;mso-position-horizontal:absolute;mso-position-horizontal-relative:text;mso-position-vertical:absolute;mso-position-vertical-relative:text;mso-width-percent:0;mso-height-percent:0;mso-width-relative:page;mso-height-relative:page" o:gfxdata="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">
+              <v:shape w14:anchorId="6D3C6043" id="AutoShape 26" o:spid="_x0000_s1026" type="#_x0000_t32" style="position:absolute;margin-left:111.35pt;margin-top:23.2pt;width:34.3pt;height:1.65pt;flip:x;z-index:251664896;visibility:visible;mso-wrap-style:square;mso-width-percent:0;mso-height-percent:0;mso-wrap-distance-left:9pt;mso-wrap-distance-top:0;mso-wrap-distance-right:9pt;mso-wrap-distance-bottom:0;mso-position-horizontal:absolute;mso-position-horizontal-relative:text;mso-position-vertical:absolute;mso-position-vertical-relative:text;mso-width-percent:0;mso-height-percent:0;mso-width-relative:page;mso-height-relative:page" o:gfxdata="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">
                 <v:stroke endarrow="block"/>
               </v:shape>
             </w:pict>
@@ -3707,7 +3707,7 @@
           </mc:Choice>
           <mc:Fallback>
             <w:pict>
-              <v:shape w14:anchorId="2CCB6A27" id="AutoShape 5" o:spid="_x0000_s1026" type="#_x0000_t32" style="position:absolute;margin-left:210.15pt;margin-top:-1pt;width:22.6pt;height:34.35pt;flip:x;z-index:251645440;visibility:visible;mso-wrap-style:square;mso-width-percent:0;mso-height-percent:0;mso-wrap-distance-left:9pt;mso-wrap-distance-top:0;mso-wrap-distance-right:9pt;mso-wrap-distance-bottom:0;mso-position-horizontal:absolute;mso-position-horizontal-relative:text;mso-position-vertical:absolute;mso-position-vertical-relative:text;mso-width-percent:0;mso-height-percent:0;mso-width-relative:page;mso-height-relative:page" o:gfxdata="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">
+              <v:shape w14:anchorId="1D4D52BC" id="AutoShape 5" o:spid="_x0000_s1026" type="#_x0000_t32" style="position:absolute;margin-left:210.15pt;margin-top:-1pt;width:22.6pt;height:34.35pt;flip:x;z-index:251645440;visibility:visible;mso-wrap-style:square;mso-width-percent:0;mso-height-percent:0;mso-wrap-distance-left:9pt;mso-wrap-distance-top:0;mso-wrap-distance-right:9pt;mso-wrap-distance-bottom:0;mso-position-horizontal:absolute;mso-position-horizontal-relative:text;mso-position-vertical:absolute;mso-position-vertical-relative:text;mso-width-percent:0;mso-height-percent:0;mso-width-relative:page;mso-height-relative:page" o:gfxdata="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">
                 <v:stroke endarrow="block"/>
               </v:shape>
             </w:pict>
@@ -3813,7 +3813,7 @@
           </mc:Choice>
           <mc:Fallback>
             <w:pict>
-              <v:shape w14:anchorId="3A3902EB" id="AutoShape 21" o:spid="_x0000_s1026" type="#_x0000_t32" style="position:absolute;margin-left:219.35pt;margin-top:138.05pt;width:101.25pt;height:43.5pt;flip:x y;z-index:251659776;visibility:visible;mso-wrap-style:square;mso-width-percent:0;mso-height-percent:0;mso-wrap-distance-left:9pt;mso-wrap-distance-top:0;mso-wrap-distance-right:9pt;mso-wrap-distance-bottom:0;mso-position-horizontal:absolute;mso-position-horizontal-relative:text;mso-position-vertical:absolute;mso-position-vertical-relative:text;mso-width-percent:0;mso-height-percent:0;mso-width-relative:page;mso-height-relative:page" o:gfxdata="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">
+              <v:shape w14:anchorId="2803C82E" id="AutoShape 21" o:spid="_x0000_s1026" type="#_x0000_t32" style="position:absolute;margin-left:219.35pt;margin-top:138.05pt;width:101.25pt;height:43.5pt;flip:x y;z-index:251659776;visibility:visible;mso-wrap-style:square;mso-width-percent:0;mso-height-percent:0;mso-wrap-distance-left:9pt;mso-wrap-distance-top:0;mso-wrap-distance-right:9pt;mso-wrap-distance-bottom:0;mso-position-horizontal:absolute;mso-position-horizontal-relative:text;mso-position-vertical:absolute;mso-position-vertical-relative:text;mso-width-percent:0;mso-height-percent:0;mso-width-relative:page;mso-height-relative:page" o:gfxdata="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">
                 <v:stroke endarrow="block"/>
               </v:shape>
             </w:pict>
@@ -4029,7 +4029,7 @@
           </mc:Choice>
           <mc:Fallback>
             <w:pict>
-              <v:shape w14:anchorId="5CC8FADD" id="AutoShape 19" o:spid="_x0000_s1026" type="#_x0000_t32" style="position:absolute;margin-left:219.35pt;margin-top:216.7pt;width:13.4pt;height:17.3pt;flip:y;z-index:251657728;visibility:visible;mso-wrap-style:square;mso-width-percent:0;mso-height-percent:0;mso-wrap-distance-left:9pt;mso-wrap-distance-top:0;mso-wrap-distance-right:9pt;mso-wrap-distance-bottom:0;mso-position-horizontal:absolute;mso-position-horizontal-relative:text;mso-position-vertical:absolute;mso-position-vertical-relative:text;mso-width-percent:0;mso-height-percent:0;mso-width-relative:page;mso-height-relative:page" o:gfxdata="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">
+              <v:shape w14:anchorId="49D56CD2" id="AutoShape 19" o:spid="_x0000_s1026" type="#_x0000_t32" style="position:absolute;margin-left:219.35pt;margin-top:216.7pt;width:13.4pt;height:17.3pt;flip:y;z-index:251657728;visibility:visible;mso-wrap-style:square;mso-width-percent:0;mso-height-percent:0;mso-wrap-distance-left:9pt;mso-wrap-distance-top:0;mso-wrap-distance-right:9pt;mso-wrap-distance-bottom:0;mso-position-horizontal:absolute;mso-position-horizontal-relative:text;mso-position-vertical:absolute;mso-position-vertical-relative:text;mso-width-percent:0;mso-height-percent:0;mso-width-relative:page;mso-height-relative:page" o:gfxdata="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">
                 <v:stroke endarrow="block"/>
               </v:shape>
             </w:pict>
@@ -4110,7 +4110,7 @@
           </mc:Choice>
           <mc:Fallback>
             <w:pict>
-              <v:shape w14:anchorId="639F19AC" id="AutoShape 15" o:spid="_x0000_s1026" type="#_x0000_t32" style="position:absolute;margin-left:219.35pt;margin-top:130.5pt;width:101.3pt;height:12.55pt;flip:x y;z-index:251655680;visibility:visible;mso-wrap-style:square;mso-width-percent:0;mso-height-percent:0;mso-wrap-distance-left:9pt;mso-wrap-distance-top:0;mso-wrap-distance-right:9pt;mso-wrap-distance-bottom:0;mso-position-horizontal:absolute;mso-position-horizontal-relative:text;mso-position-vertical:absolute;mso-position-vertical-relative:text;mso-width-percent:0;mso-height-percent:0;mso-width-relative:page;mso-height-relative:page" o:gfxdata="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">
+              <v:shape w14:anchorId="2A75FEC3" id="AutoShape 15" o:spid="_x0000_s1026" type="#_x0000_t32" style="position:absolute;margin-left:219.35pt;margin-top:130.5pt;width:101.3pt;height:12.55pt;flip:x y;z-index:251655680;visibility:visible;mso-wrap-style:square;mso-width-percent:0;mso-height-percent:0;mso-wrap-distance-left:9pt;mso-wrap-distance-top:0;mso-wrap-distance-right:9pt;mso-wrap-distance-bottom:0;mso-position-horizontal:absolute;mso-position-horizontal-relative:text;mso-position-vertical:absolute;mso-position-vertical-relative:text;mso-width-percent:0;mso-height-percent:0;mso-width-relative:page;mso-height-relative:page" o:gfxdata="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">
                 <v:stroke endarrow="block"/>
               </v:shape>
             </w:pict>
@@ -4578,7 +4578,7 @@
           </mc:Choice>
           <mc:Fallback>
             <w:pict>
-              <v:shape w14:anchorId="2B6A8B70" id="AutoShape 12" o:spid="_x0000_s1026" type="#_x0000_t32" style="position:absolute;margin-left:277.95pt;margin-top:110.4pt;width:42.7pt;height:.85pt;flip:x;z-index:251652608;visibility:visible;mso-wrap-style:square;mso-width-percent:0;mso-height-percent:0;mso-wrap-distance-left:9pt;mso-wrap-distance-top:0;mso-wrap-distance-right:9pt;mso-wrap-distance-bottom:0;mso-position-horizontal:absolute;mso-position-horizontal-relative:text;mso-position-vertical:absolute;mso-position-vertical-relative:text;mso-width-percent:0;mso-height-percent:0;mso-width-relative:page;mso-height-relative:page" o:gfxdata="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">
+              <v:shape w14:anchorId="2329EB60" id="AutoShape 12" o:spid="_x0000_s1026" type="#_x0000_t32" style="position:absolute;margin-left:277.95pt;margin-top:110.4pt;width:42.7pt;height:.85pt;flip:x;z-index:251652608;visibility:visible;mso-wrap-style:square;mso-width-percent:0;mso-height-percent:0;mso-wrap-distance-left:9pt;mso-wrap-distance-top:0;mso-wrap-distance-right:9pt;mso-wrap-distance-bottom:0;mso-position-horizontal:absolute;mso-position-horizontal-relative:text;mso-position-vertical:absolute;mso-position-vertical-relative:text;mso-width-percent:0;mso-height-percent:0;mso-width-relative:page;mso-height-relative:page" o:gfxdata="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">
                 <v:stroke endarrow="block"/>
               </v:shape>
             </w:pict>
@@ -4659,7 +4659,7 @@
           </mc:Choice>
           <mc:Fallback>
             <w:pict>
-              <v:shape w14:anchorId="2612CBC0" id="AutoShape 11" o:spid="_x0000_s1026" type="#_x0000_t32" style="position:absolute;margin-left:277.95pt;margin-top:81.1pt;width:42.7pt;height:.85pt;flip:x;z-index:251651584;visibility:visible;mso-wrap-style:square;mso-width-percent:0;mso-height-percent:0;mso-wrap-distance-left:9pt;mso-wrap-distance-top:0;mso-wrap-distance-right:9pt;mso-wrap-distance-bottom:0;mso-position-horizontal:absolute;mso-position-horizontal-relative:text;mso-position-vertical:absolute;mso-position-vertical-relative:text;mso-width-percent:0;mso-height-percent:0;mso-width-relative:page;mso-height-relative:page" o:gfxdata="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">
+              <v:shape w14:anchorId="77C41050" id="AutoShape 11" o:spid="_x0000_s1026" type="#_x0000_t32" style="position:absolute;margin-left:277.95pt;margin-top:81.1pt;width:42.7pt;height:.85pt;flip:x;z-index:251651584;visibility:visible;mso-wrap-style:square;mso-width-percent:0;mso-height-percent:0;mso-wrap-distance-left:9pt;mso-wrap-distance-top:0;mso-wrap-distance-right:9pt;mso-wrap-distance-bottom:0;mso-position-horizontal:absolute;mso-position-horizontal-relative:text;mso-position-vertical:absolute;mso-position-vertical-relative:text;mso-width-percent:0;mso-height-percent:0;mso-width-relative:page;mso-height-relative:page" o:gfxdata="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">
                 <v:stroke endarrow="block"/>
               </v:shape>
             </w:pict>
@@ -4855,7 +4855,7 @@
           </mc:Choice>
           <mc:Fallback>
             <w:pict>
-              <v:shape w14:anchorId="255A089A" id="AutoShape 9" o:spid="_x0000_s1026" type="#_x0000_t32" style="position:absolute;margin-left:294.7pt;margin-top:22.5pt;width:63.65pt;height:0;flip:x;z-index:251649536;visibility:visible;mso-wrap-style:square;mso-width-percent:0;mso-height-percent:0;mso-wrap-distance-left:9pt;mso-wrap-distance-top:0;mso-wrap-distance-right:9pt;mso-wrap-distance-bottom:0;mso-position-horizontal:absolute;mso-position-horizontal-relative:text;mso-position-vertical:absolute;mso-position-vertical-relative:text;mso-width-percent:0;mso-height-percent:0;mso-width-relative:page;mso-height-relative:page" o:gfxdata="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">
+              <v:shape w14:anchorId="778FFD08" id="AutoShape 9" o:spid="_x0000_s1026" type="#_x0000_t32" style="position:absolute;margin-left:294.7pt;margin-top:22.5pt;width:63.65pt;height:0;flip:x;z-index:251649536;visibility:visible;mso-wrap-style:square;mso-width-percent:0;mso-height-percent:0;mso-wrap-distance-left:9pt;mso-wrap-distance-top:0;mso-wrap-distance-right:9pt;mso-wrap-distance-bottom:0;mso-position-horizontal:absolute;mso-position-horizontal-relative:text;mso-position-vertical:absolute;mso-position-vertical-relative:text;mso-width-percent:0;mso-height-percent:0;mso-width-relative:page;mso-height-relative:page" o:gfxdata="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">
                 <v:stroke endarrow="block"/>
               </v:shape>
             </w:pict>
@@ -4936,7 +4936,7 @@
           </mc:Choice>
           <mc:Fallback>
             <w:pict>
-              <v:shape w14:anchorId="62ADEA69" id="AutoShape 7" o:spid="_x0000_s1026" type="#_x0000_t32" style="position:absolute;margin-left:123.9pt;margin-top:49.3pt;width:79.55pt;height:0;z-index:251647488;visibility:visible;mso-wrap-style:square;mso-width-percent:0;mso-height-percent:0;mso-wrap-distance-left:9pt;mso-wrap-distance-top:0;mso-wrap-distance-right:9pt;mso-wrap-distance-bottom:0;mso-position-horizontal:absolute;mso-position-horizontal-relative:text;mso-position-vertical:absolute;mso-position-vertical-relative:text;mso-width-percent:0;mso-height-percent:0;mso-width-relative:page;mso-height-relative:page" o:gfxdata="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">
+              <v:shape w14:anchorId="2619536A" id="AutoShape 7" o:spid="_x0000_s1026" type="#_x0000_t32" style="position:absolute;margin-left:123.9pt;margin-top:49.3pt;width:79.55pt;height:0;z-index:251647488;visibility:visible;mso-wrap-style:square;mso-width-percent:0;mso-height-percent:0;mso-wrap-distance-left:9pt;mso-wrap-distance-top:0;mso-wrap-distance-right:9pt;mso-wrap-distance-bottom:0;mso-position-horizontal:absolute;mso-position-horizontal-relative:text;mso-position-vertical:absolute;mso-position-vertical-relative:text;mso-width-percent:0;mso-height-percent:0;mso-width-relative:page;mso-height-relative:page" o:gfxdata="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">
                 <v:stroke endarrow="block"/>
               </v:shape>
             </w:pict>
@@ -6773,7 +6773,7 @@
           </mc:Choice>
           <mc:Fallback>
             <w:pict>
-              <v:shape w14:anchorId="044DCA65" id="AutoShape 51" o:spid="_x0000_s1026" type="#_x0000_t32" style="position:absolute;margin-left:76.2pt;margin-top:50.2pt;width:12.55pt;height:17.9pt;flip:y;z-index:251686400;visibility:visible;mso-wrap-style:square;mso-width-percent:0;mso-height-percent:0;mso-wrap-distance-left:9pt;mso-wrap-distance-top:0;mso-wrap-distance-right:9pt;mso-wrap-distance-bottom:0;mso-position-horizontal:absolute;mso-position-horizontal-relative:text;mso-position-vertical:absolute;mso-position-vertical-relative:text;mso-width-percent:0;mso-height-percent:0;mso-width-relative:page;mso-height-relative:page" o:gfxdata="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">
+              <v:shape w14:anchorId="26577584" id="AutoShape 51" o:spid="_x0000_s1026" type="#_x0000_t32" style="position:absolute;margin-left:76.2pt;margin-top:50.2pt;width:12.55pt;height:17.9pt;flip:y;z-index:251686400;visibility:visible;mso-wrap-style:square;mso-width-percent:0;mso-height-percent:0;mso-wrap-distance-left:9pt;mso-wrap-distance-top:0;mso-wrap-distance-right:9pt;mso-wrap-distance-bottom:0;mso-position-horizontal:absolute;mso-position-horizontal-relative:text;mso-position-vertical:absolute;mso-position-vertical-relative:text;mso-width-percent:0;mso-height-percent:0;mso-width-relative:page;mso-height-relative:page" o:gfxdata="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">
                 <v:stroke endarrow="block"/>
               </v:shape>
             </w:pict>
@@ -6854,7 +6854,7 @@
           </mc:Choice>
           <mc:Fallback>
             <w:pict>
-              <v:shape w14:anchorId="3F9FD7BF" id="AutoShape 47" o:spid="_x0000_s1026" type="#_x0000_t32" style="position:absolute;margin-left:129.75pt;margin-top:50.2pt;width:11.45pt;height:25.1pt;flip:x y;z-index:251679232;visibility:visible;mso-wrap-style:square;mso-width-percent:0;mso-height-percent:0;mso-wrap-distance-left:9pt;mso-wrap-distance-top:0;mso-wrap-distance-right:9pt;mso-wrap-distance-bottom:0;mso-position-horizontal:absolute;mso-position-horizontal-relative:text;mso-position-vertical:absolute;mso-position-vertical-relative:text;mso-width-percent:0;mso-height-percent:0;mso-width-relative:page;mso-height-relative:page" o:gfxdata="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">
+              <v:shape w14:anchorId="5DFC4A67" id="AutoShape 47" o:spid="_x0000_s1026" type="#_x0000_t32" style="position:absolute;margin-left:129.75pt;margin-top:50.2pt;width:11.45pt;height:25.1pt;flip:x y;z-index:251679232;visibility:visible;mso-wrap-style:square;mso-width-percent:0;mso-height-percent:0;mso-wrap-distance-left:9pt;mso-wrap-distance-top:0;mso-wrap-distance-right:9pt;mso-wrap-distance-bottom:0;mso-position-horizontal:absolute;mso-position-horizontal-relative:text;mso-position-vertical:absolute;mso-position-vertical-relative:text;mso-width-percent:0;mso-height-percent:0;mso-width-relative:page;mso-height-relative:page" o:gfxdata="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">
                 <v:stroke endarrow="block"/>
               </v:shape>
             </w:pict>
@@ -12938,7 +12938,21 @@
           <w:color w:val="000000" w:themeColor="text1"/>
         </w:rPr>
         <w:tab/>
-        <w:t>Partly Clear: 1 Jabo available; -1 DRM on Carpet Bombing table</w:t>
+        <w:t xml:space="preserve">Partly Clear: 1 Jabo available; </w:t>
+      </w:r>
+      <w:r>
+        <w:rPr>
+          <w:rStyle w:val="IntenseEmphasis"/>
+          <w:color w:val="000000" w:themeColor="text1"/>
+        </w:rPr>
+        <w:t>+</w:t>
+      </w:r>
+      <w:r>
+        <w:rPr>
+          <w:rStyle w:val="IntenseEmphasis"/>
+          <w:color w:val="000000" w:themeColor="text1"/>
+        </w:rPr>
+        <w:t>1 DRM on Carpet Bombing table</w:t>
       </w:r>
       <w:r>
         <w:rPr>
@@ -13042,6 +13056,37 @@
           <w:rStyle w:val="IntenseEmphasis"/>
           <w:color w:val="000000" w:themeColor="text1"/>
         </w:rPr>
+        <w:t>When Carpet Bombing is listed as an air asset, roll for each army listed to advance. Apply any DRM to that army.</w:t>
+      </w:r>
+    </w:p>
+    <w:p>
+      <w:pPr>
+        <w:autoSpaceDE w:val="0"/>
+        <w:autoSpaceDN w:val="0"/>
+        <w:adjustRightInd w:val="0"/>
+        <w:spacing w:after="0" w:line="240" w:lineRule="auto"/>
+        <w:rPr>
+          <w:rStyle w:val="IntenseEmphasis"/>
+          <w:color w:val="000000" w:themeColor="text1"/>
+        </w:rPr>
+      </w:pPr>
+    </w:p>
+    <w:p>
+      <w:pPr>
+        <w:autoSpaceDE w:val="0"/>
+        <w:autoSpaceDN w:val="0"/>
+        <w:adjustRightInd w:val="0"/>
+        <w:spacing w:after="0" w:line="240" w:lineRule="auto"/>
+        <w:rPr>
+          <w:rStyle w:val="IntenseEmphasis"/>
+          <w:color w:val="000000" w:themeColor="text1"/>
+        </w:rPr>
+      </w:pPr>
+      <w:r>
+        <w:rPr>
+          <w:rStyle w:val="IntenseEmphasis"/>
+          <w:color w:val="000000" w:themeColor="text1"/>
+        </w:rPr>
         <w:t>The carpet bombing table will determine if the carpet bombing has any negative effect on the attack due to “creep back” (friendly fire).</w:t>
       </w:r>
       <w:r>
@@ -13049,7 +13094,35 @@
           <w:rStyle w:val="IntenseEmphasis"/>
           <w:color w:val="000000" w:themeColor="text1"/>
         </w:rPr>
-        <w:t xml:space="preserve">  Carpet bombing is allocated to the first army listed on the air power card. Only some event cards have carpet </w:t>
+        <w:t xml:space="preserve">  Carpet bombing is allocated to</w:t>
+      </w:r>
+      <w:r>
+        <w:rPr>
+          <w:rStyle w:val="IntenseEmphasis"/>
+          <w:color w:val="000000" w:themeColor="text1"/>
+        </w:rPr>
+        <w:t xml:space="preserve"> each </w:t>
+      </w:r>
+      <w:r>
+        <w:rPr>
+          <w:rStyle w:val="IntenseEmphasis"/>
+          <w:color w:val="000000" w:themeColor="text1"/>
+        </w:rPr>
+        <w:t xml:space="preserve"> army listed on the </w:t>
+      </w:r>
+      <w:r>
+        <w:rPr>
+          <w:rStyle w:val="IntenseEmphasis"/>
+          <w:color w:val="000000" w:themeColor="text1"/>
+        </w:rPr>
+        <w:t xml:space="preserve">Military section of the </w:t>
+      </w:r>
+      <w:r>
+        <w:rPr>
+          <w:rStyle w:val="IntenseEmphasis"/>
+          <w:color w:val="000000" w:themeColor="text1"/>
+        </w:rPr>
+        <w:t xml:space="preserve">card. Only some event cards have carpet </w:t>
       </w:r>
       <w:r>
         <w:rPr>
@@ -13101,7 +13174,14 @@
           <w:rStyle w:val="IntenseEmphasis"/>
           <w:color w:val="000000" w:themeColor="text1"/>
         </w:rPr>
-        <w:t>1-4</w:t>
+        <w:t>1-</w:t>
+      </w:r>
+      <w:r>
+        <w:rPr>
+          <w:rStyle w:val="IntenseEmphasis"/>
+          <w:color w:val="000000" w:themeColor="text1"/>
+        </w:rPr>
+        <w:t>4</w:t>
       </w:r>
       <w:r>
         <w:rPr>
@@ -13109,7 +13189,14 @@
           <w:color w:val="000000" w:themeColor="text1"/>
         </w:rPr>
         <w:tab/>
-        <w:t xml:space="preserve"> No Effect</w:t>
+        <w:t xml:space="preserve"> </w:t>
+      </w:r>
+      <w:r>
+        <w:rPr>
+          <w:rStyle w:val="IntenseEmphasis"/>
+          <w:color w:val="000000" w:themeColor="text1"/>
+        </w:rPr>
+        <w:t>No effect</w:t>
       </w:r>
     </w:p>
     <w:p>
@@ -13165,7 +13252,27 @@
           <w:color w:val="000000" w:themeColor="text1"/>
         </w:rPr>
         <w:tab/>
-        <w:t>Attack cancelled</w:t>
+      </w:r>
+      <w:r>
+        <w:rPr>
+          <w:rStyle w:val="IntenseEmphasis"/>
+          <w:color w:val="000000" w:themeColor="text1"/>
+        </w:rPr>
+        <w:t>Carpet Bombing mission</w:t>
+      </w:r>
+      <w:r>
+        <w:rPr>
+          <w:rStyle w:val="IntenseEmphasis"/>
+          <w:color w:val="000000" w:themeColor="text1"/>
+        </w:rPr>
+        <w:t xml:space="preserve"> cancelled</w:t>
+      </w:r>
+      <w:r>
+        <w:rPr>
+          <w:rStyle w:val="IntenseEmphasis"/>
+          <w:color w:val="000000" w:themeColor="text1"/>
+        </w:rPr>
+        <w:t xml:space="preserve"> (remove Carpet Bombing marker)</w:t>
       </w:r>
     </w:p>
     <w:p>
@@ -14012,7 +14119,14 @@
           <w:rStyle w:val="IntenseEmphasis"/>
           <w:color w:val="000000" w:themeColor="text1"/>
         </w:rPr>
-        <w:t>All these units appear as reinforcements on the Event Cards; except 21</w:t>
+        <w:t xml:space="preserve">All these units appear as reinforcements on the Event Cards; except </w:t>
+      </w:r>
+      <w:r>
+        <w:rPr>
+          <w:rStyle w:val="IntenseEmphasis"/>
+          <w:color w:val="000000" w:themeColor="text1"/>
+        </w:rPr>
+        <w:t>terrain</w:t>
       </w:r>
       <w:r>
         <w:rPr>
@@ -14058,7 +14172,21 @@
           <w:rStyle w:val="IntenseEmphasis"/>
           <w:color w:val="000000" w:themeColor="text1"/>
         </w:rPr>
-        <w:t xml:space="preserve">If German units successfully defend a space, there is no affect on their combat capabilities. If they lose the combat and the Allied army advances in to that space, all Nebelwerfer and 88 Units are eliminated and panzer units are </w:t>
+        <w:t xml:space="preserve">If German units successfully defend a space, there is no </w:t>
+      </w:r>
+      <w:r>
+        <w:rPr>
+          <w:rStyle w:val="IntenseEmphasis"/>
+          <w:color w:val="000000" w:themeColor="text1"/>
+        </w:rPr>
+        <w:t>e</w:t>
+      </w:r>
+      <w:r>
+        <w:rPr>
+          <w:rStyle w:val="IntenseEmphasis"/>
+          <w:color w:val="000000" w:themeColor="text1"/>
+        </w:rPr>
+        <w:t xml:space="preserve">ffect on their combat capabilities. If they lose the combat and the Allied army advances in to that space, all Nebelwerfer and 88 Units are eliminated and panzer units are </w:t>
       </w:r>
       <w:r>
         <w:rPr>
@@ -14224,7 +14352,15 @@
           <w:rStyle w:val="IntenseEmphasis"/>
           <w:color w:val="000000" w:themeColor="text1"/>
         </w:rPr>
-        <w:t xml:space="preserve"> It is not necessary to use German combat units in an attack; an Allied army can</w:t>
+        <w:t xml:space="preserve"> It is not necessary to use German combat </w:t>
+      </w:r>
+      <w:r>
+        <w:rPr>
+          <w:rStyle w:val="IntenseEmphasis"/>
+          <w:color w:val="000000" w:themeColor="text1"/>
+        </w:rPr>
+        <w:lastRenderedPageBreak/>
+        <w:t>units in an attack; an Allied army can</w:t>
       </w:r>
       <w:r>
         <w:rPr>
@@ -14276,7 +14412,6 @@
           <w:rStyle w:val="IntenseEmphasis"/>
           <w:color w:val="000000" w:themeColor="text1"/>
         </w:rPr>
-        <w:lastRenderedPageBreak/>
         <w:t>If the player wins the combat, some, none or all of the panzer units/nebelwerfers can advance to the previously Allied occupied space.</w:t>
       </w:r>
     </w:p>
@@ -14838,7 +14973,49 @@
           <w:rStyle w:val="IntenseEmphasis"/>
           <w:color w:val="000000" w:themeColor="text1"/>
         </w:rPr>
-        <w:t>In addition to resource rolls by the player and changes indicated on the cards, the Hitler Approval level rises by one when a combat is won in which panzer units are involved and drops by one when a combat is lost in which panzer units are involved. Additionally, the Hitler approval level drops by one when S.Caen and/or Cherbourg are lost.</w:t>
+        <w:t>In addition to resource rolls by the player and changes indicated on the cards, the Hitler Approval level rises by one when a</w:t>
+      </w:r>
+      <w:r>
+        <w:rPr>
+          <w:rStyle w:val="IntenseEmphasis"/>
+          <w:color w:val="000000" w:themeColor="text1"/>
+        </w:rPr>
+        <w:t xml:space="preserve"> </w:t>
+      </w:r>
+      <w:r>
+        <w:rPr>
+          <w:rStyle w:val="IntenseEmphasis"/>
+          <w:color w:val="000000" w:themeColor="text1"/>
+        </w:rPr>
+        <w:t xml:space="preserve">combat is won in which panzer units are involved </w:t>
+      </w:r>
+      <w:r>
+        <w:rPr>
+          <w:rStyle w:val="IntenseEmphasis"/>
+          <w:color w:val="000000" w:themeColor="text1"/>
+        </w:rPr>
+        <w:t xml:space="preserve">(attack only) </w:t>
+      </w:r>
+      <w:r>
+        <w:rPr>
+          <w:rStyle w:val="IntenseEmphasis"/>
+          <w:color w:val="000000" w:themeColor="text1"/>
+        </w:rPr>
+        <w:t>and drops by one when a combat is lost in which panzer units are involved</w:t>
+      </w:r>
+      <w:r>
+        <w:rPr>
+          <w:rStyle w:val="IntenseEmphasis"/>
+          <w:color w:val="000000" w:themeColor="text1"/>
+        </w:rPr>
+        <w:t xml:space="preserve"> (defense only)</w:t>
+      </w:r>
+      <w:r>
+        <w:rPr>
+          <w:rStyle w:val="IntenseEmphasis"/>
+          <w:color w:val="000000" w:themeColor="text1"/>
+        </w:rPr>
+        <w:t>. Additionally, the Hitler approval level drops by one when S.Caen and/or Cherbourg are lost.</w:t>
       </w:r>
     </w:p>
     <w:p>
@@ -15086,6 +15263,7 @@
           <w:rStyle w:val="IntenseEmphasis"/>
           <w:color w:val="000000" w:themeColor="text1"/>
         </w:rPr>
+        <w:lastRenderedPageBreak/>
         <w:t>At the end of the first deck, if S Caen, Cherbourg and Avranches are all Allied controlled the game ends immediately in a German defeat.</w:t>
       </w:r>
     </w:p>
@@ -15117,7 +15295,6 @@
           <w:rStyle w:val="IntenseEmphasis"/>
           <w:color w:val="000000" w:themeColor="text1"/>
         </w:rPr>
-        <w:lastRenderedPageBreak/>
         <w:t>[8.2] Refresh the Map. Remove all DRM markers</w:t>
       </w:r>
       <w:r>

</xml_diff>